<commit_message>
Add Rechart and display on the dashboard
</commit_message>
<xml_diff>
--- a/the-wild-oasis.docx
+++ b/the-wild-oasis.docx
@@ -930,6 +930,7 @@
       </w:pPr>
       <w:r>
         <w:rPr>
+          <w:noProof/>
           <w:lang w:val="en-US"/>
         </w:rPr>
         <w:drawing>
@@ -990,6 +991,7 @@
       </w:pPr>
       <w:r>
         <w:rPr>
+          <w:noProof/>
           <w:lang w:val="en-US"/>
         </w:rPr>
         <w:lastRenderedPageBreak/>
@@ -1056,6 +1058,7 @@
       </w:r>
       <w:r>
         <w:rPr>
+          <w:noProof/>
           <w:lang w:val="en-US"/>
         </w:rPr>
         <w:drawing>
@@ -1093,6 +1096,48 @@
             </a:graphic>
           </wp:inline>
         </w:drawing>
+      </w:r>
+    </w:p>
+    <w:p>
+      <w:pPr>
+        <w:rPr>
+          <w:lang w:val="en-US"/>
+        </w:rPr>
+      </w:pPr>
+    </w:p>
+    <w:p>
+      <w:pPr>
+        <w:rPr>
+          <w:lang w:val="en-US"/>
+        </w:rPr>
+      </w:pPr>
+      <w:r>
+        <w:rPr>
+          <w:lang w:val="en-US"/>
+        </w:rPr>
+        <w:t xml:space="preserve">One of the most popular chart library is </w:t>
+      </w:r>
+      <w:r>
+        <w:rPr>
+          <w:b/>
+          <w:bCs/>
+          <w:lang w:val="en-US"/>
+        </w:rPr>
+        <w:t>recharts</w:t>
+      </w:r>
+      <w:r>
+        <w:rPr>
+          <w:b/>
+          <w:bCs/>
+          <w:lang w:val="en-US"/>
+        </w:rPr>
+        <w:t xml:space="preserve">@2 </w:t>
+      </w:r>
+      <w:r>
+        <w:rPr>
+          <w:lang w:val="en-US"/>
+        </w:rPr>
+        <w:t>(version can be different)</w:t>
       </w:r>
     </w:p>
     <w:sectPr>

</xml_diff>